<commit_message>
Programme Management: Replace PHI-001 Programme History with controlled production version
</commit_message>
<xml_diff>
--- a/tooling/ProgrammeManagement/00 Programme Office/PHI-001 Programme History.docx
+++ b/tooling/ProgrammeManagement/00 Programme Office/PHI-001 Programme History.docx
@@ -4,35 +4,44 @@
   <w:body>
     <w:p>
       <w:pPr>
-        <w:pStyle w:val="Heading1"/>
+        <w:jc w:val="center"/>
       </w:pPr>
       <w:r>
-        <w:t>JUSTDEFENDERS® PROGRAMME MANAGEMENT SYSTEM</w:t>
+        <w:rPr>
+          <w:b/>
+          <w:sz w:val="48"/>
+        </w:rPr>
+        <w:t>PHI-001</w:t>
+        <w:br/>
+        <w:t>Programme History</w:t>
+      </w:r>
+    </w:p>
+    <w:p>
+      <w:r>
+        <w:t>Repository: tooling\ProgrammeManagement\00 Programme Office\</w:t>
+      </w:r>
+    </w:p>
+    <w:p>
+      <w:r>
+        <w:t>Filename: PHI-001 Programme History.docx</w:t>
+      </w:r>
+    </w:p>
+    <w:p>
+      <w:r>
+        <w:br w:type="page"/>
       </w:r>
     </w:p>
     <w:p>
       <w:pPr>
-        <w:pStyle w:val="Heading2"/>
+        <w:pStyle w:val="Heading1"/>
       </w:pPr>
       <w:r>
-        <w:t>PHI-001 Programme History</w:t>
-      </w:r>
-    </w:p>
-    <w:p>
-      <w:r>
-        <w:t>Records the chronological history of the JustDefenders programme.</w:t>
-      </w:r>
-    </w:p>
-    <w:p>
-      <w:pPr>
-        <w:pStyle w:val="Heading2"/>
-      </w:pPr>
-      <w:r>
-        <w:t>Engineering Control</w:t>
+        <w:t>Engineering Control Record</w:t>
       </w:r>
     </w:p>
     <w:tbl>
       <w:tblPr>
+        <w:tblStyle w:val="TableGrid"/>
         <w:tblW w:type="auto" w:w="0"/>
         <w:tblLook w:firstColumn="1" w:firstRow="1" w:lastColumn="0" w:lastRow="0" w:noHBand="0" w:noVBand="1" w:val="04A0"/>
       </w:tblPr>
@@ -40,6 +49,72 @@
         <w:gridCol w:w="4320"/>
         <w:gridCol w:w="4320"/>
       </w:tblGrid>
+      <w:tr>
+        <w:tc>
+          <w:tcPr>
+            <w:tcW w:type="dxa" w:w="4320"/>
+          </w:tcPr>
+          <w:p>
+            <w:r>
+              <w:t>Field</w:t>
+            </w:r>
+          </w:p>
+        </w:tc>
+        <w:tc>
+          <w:tcPr>
+            <w:tcW w:type="dxa" w:w="4320"/>
+          </w:tcPr>
+          <w:p>
+            <w:r>
+              <w:t>Value</w:t>
+            </w:r>
+          </w:p>
+        </w:tc>
+      </w:tr>
+      <w:tr>
+        <w:tc>
+          <w:tcPr>
+            <w:tcW w:type="dxa" w:w="4320"/>
+          </w:tcPr>
+          <w:p>
+            <w:r>
+              <w:t>Document ID</w:t>
+            </w:r>
+          </w:p>
+        </w:tc>
+        <w:tc>
+          <w:tcPr>
+            <w:tcW w:type="dxa" w:w="4320"/>
+          </w:tcPr>
+          <w:p>
+            <w:r>
+              <w:t>PHI-001</w:t>
+            </w:r>
+          </w:p>
+        </w:tc>
+      </w:tr>
+      <w:tr>
+        <w:tc>
+          <w:tcPr>
+            <w:tcW w:type="dxa" w:w="4320"/>
+          </w:tcPr>
+          <w:p>
+            <w:r>
+              <w:t>Title</w:t>
+            </w:r>
+          </w:p>
+        </w:tc>
+        <w:tc>
+          <w:tcPr>
+            <w:tcW w:type="dxa" w:w="4320"/>
+          </w:tcPr>
+          <w:p>
+            <w:r>
+              <w:t>Programme History</w:t>
+            </w:r>
+          </w:p>
+        </w:tc>
+      </w:tr>
       <w:tr>
         <w:tc>
           <w:tcPr>
@@ -58,6 +133,94 @@
           <w:p>
             <w:r>
               <w:t>CONTROLLED</w:t>
+            </w:r>
+          </w:p>
+        </w:tc>
+      </w:tr>
+      <w:tr>
+        <w:tc>
+          <w:tcPr>
+            <w:tcW w:type="dxa" w:w="4320"/>
+          </w:tcPr>
+          <w:p>
+            <w:r>
+              <w:t>Version</w:t>
+            </w:r>
+          </w:p>
+        </w:tc>
+        <w:tc>
+          <w:tcPr>
+            <w:tcW w:type="dxa" w:w="4320"/>
+          </w:tcPr>
+          <w:p>
+            <w:r>
+              <w:t>1.0</w:t>
+            </w:r>
+          </w:p>
+        </w:tc>
+      </w:tr>
+      <w:tr>
+        <w:tc>
+          <w:tcPr>
+            <w:tcW w:type="dxa" w:w="4320"/>
+          </w:tcPr>
+          <w:p>
+            <w:r>
+              <w:t>Owner</w:t>
+            </w:r>
+          </w:p>
+        </w:tc>
+        <w:tc>
+          <w:tcPr>
+            <w:tcW w:type="dxa" w:w="4320"/>
+          </w:tcPr>
+          <w:p>
+            <w:r>
+              <w:t>Programme Office</w:t>
+            </w:r>
+          </w:p>
+        </w:tc>
+      </w:tr>
+      <w:tr>
+        <w:tc>
+          <w:tcPr>
+            <w:tcW w:type="dxa" w:w="4320"/>
+          </w:tcPr>
+          <w:p>
+            <w:r>
+              <w:t>Repository Path</w:t>
+            </w:r>
+          </w:p>
+        </w:tc>
+        <w:tc>
+          <w:tcPr>
+            <w:tcW w:type="dxa" w:w="4320"/>
+          </w:tcPr>
+          <w:p>
+            <w:r>
+              <w:t>tooling\ProgrammeManagement\00 Programme Office\</w:t>
+            </w:r>
+          </w:p>
+        </w:tc>
+      </w:tr>
+      <w:tr>
+        <w:tc>
+          <w:tcPr>
+            <w:tcW w:type="dxa" w:w="4320"/>
+          </w:tcPr>
+          <w:p>
+            <w:r>
+              <w:t>Filename</w:t>
+            </w:r>
+          </w:p>
+        </w:tc>
+        <w:tc>
+          <w:tcPr>
+            <w:tcW w:type="dxa" w:w="4320"/>
+          </w:tcPr>
+          <w:p>
+            <w:r>
+              <w:t>PHI-001 Programme History.docx</w:t>
             </w:r>
           </w:p>
         </w:tc>
@@ -91,7 +254,642 @@
           </w:tcPr>
           <w:p>
             <w:r>
-              <w:t>Repository Path</w:t>
+              <w:t>Last Updated</w:t>
+            </w:r>
+          </w:p>
+        </w:tc>
+        <w:tc>
+          <w:tcPr>
+            <w:tcW w:type="dxa" w:w="4320"/>
+          </w:tcPr>
+          <w:p>
+            <w:r/>
+          </w:p>
+        </w:tc>
+      </w:tr>
+      <w:tr>
+        <w:tc>
+          <w:tcPr>
+            <w:tcW w:type="dxa" w:w="4320"/>
+          </w:tcPr>
+          <w:p>
+            <w:r>
+              <w:t>Next Review</w:t>
+            </w:r>
+          </w:p>
+        </w:tc>
+        <w:tc>
+          <w:tcPr>
+            <w:tcW w:type="dxa" w:w="4320"/>
+          </w:tcPr>
+          <w:p>
+            <w:r/>
+          </w:p>
+        </w:tc>
+      </w:tr>
+    </w:tbl>
+    <w:p>
+      <w:pPr>
+        <w:pStyle w:val="Heading1"/>
+      </w:pPr>
+      <w:r>
+        <w:t>Revision History</w:t>
+      </w:r>
+    </w:p>
+    <w:tbl>
+      <w:tblPr>
+        <w:tblStyle w:val="TableGrid"/>
+        <w:tblW w:type="auto" w:w="0"/>
+        <w:tblLook w:firstColumn="1" w:firstRow="1" w:lastColumn="0" w:lastRow="0" w:noHBand="0" w:noVBand="1" w:val="04A0"/>
+      </w:tblPr>
+      <w:tblGrid>
+        <w:gridCol w:w="1728"/>
+        <w:gridCol w:w="1728"/>
+        <w:gridCol w:w="1728"/>
+        <w:gridCol w:w="1728"/>
+        <w:gridCol w:w="1728"/>
+      </w:tblGrid>
+      <w:tr>
+        <w:tc>
+          <w:tcPr>
+            <w:tcW w:type="dxa" w:w="1728"/>
+          </w:tcPr>
+          <w:p>
+            <w:r>
+              <w:t>Version</w:t>
+            </w:r>
+          </w:p>
+        </w:tc>
+        <w:tc>
+          <w:tcPr>
+            <w:tcW w:type="dxa" w:w="1728"/>
+          </w:tcPr>
+          <w:p>
+            <w:r>
+              <w:t>Date</w:t>
+            </w:r>
+          </w:p>
+        </w:tc>
+        <w:tc>
+          <w:tcPr>
+            <w:tcW w:type="dxa" w:w="1728"/>
+          </w:tcPr>
+          <w:p>
+            <w:r>
+              <w:t>Author</w:t>
+            </w:r>
+          </w:p>
+        </w:tc>
+        <w:tc>
+          <w:tcPr>
+            <w:tcW w:type="dxa" w:w="1728"/>
+          </w:tcPr>
+          <w:p>
+            <w:r>
+              <w:t>Change</w:t>
+            </w:r>
+          </w:p>
+        </w:tc>
+        <w:tc>
+          <w:tcPr>
+            <w:tcW w:type="dxa" w:w="1728"/>
+          </w:tcPr>
+          <w:p>
+            <w:r>
+              <w:t>Status</w:t>
+            </w:r>
+          </w:p>
+        </w:tc>
+      </w:tr>
+      <w:tr>
+        <w:tc>
+          <w:tcPr>
+            <w:tcW w:type="dxa" w:w="1728"/>
+          </w:tcPr>
+          <w:p>
+            <w:r>
+              <w:t>1.0</w:t>
+            </w:r>
+          </w:p>
+        </w:tc>
+        <w:tc>
+          <w:tcPr>
+            <w:tcW w:type="dxa" w:w="1728"/>
+          </w:tcPr>
+          <w:p>
+            <w:r/>
+          </w:p>
+        </w:tc>
+        <w:tc>
+          <w:tcPr>
+            <w:tcW w:type="dxa" w:w="1728"/>
+          </w:tcPr>
+          <w:p>
+            <w:r>
+              <w:t>Programme Office</w:t>
+            </w:r>
+          </w:p>
+        </w:tc>
+        <w:tc>
+          <w:tcPr>
+            <w:tcW w:type="dxa" w:w="1728"/>
+          </w:tcPr>
+          <w:p>
+            <w:r>
+              <w:t>Initial Issue</w:t>
+            </w:r>
+          </w:p>
+        </w:tc>
+        <w:tc>
+          <w:tcPr>
+            <w:tcW w:type="dxa" w:w="1728"/>
+          </w:tcPr>
+          <w:p>
+            <w:r>
+              <w:t>CONTROLLED</w:t>
+            </w:r>
+          </w:p>
+        </w:tc>
+      </w:tr>
+    </w:tbl>
+    <w:p>
+      <w:pPr>
+        <w:pStyle w:val="Heading1"/>
+      </w:pPr>
+      <w:r>
+        <w:t>Table of Contents</w:t>
+      </w:r>
+    </w:p>
+    <w:p>
+      <w:r>
+        <w:t>1. Cover Page</w:t>
+      </w:r>
+    </w:p>
+    <w:p>
+      <w:r>
+        <w:t>2. Engineering Control Record</w:t>
+      </w:r>
+    </w:p>
+    <w:p>
+      <w:r>
+        <w:t>3. Revision History</w:t>
+      </w:r>
+    </w:p>
+    <w:p>
+      <w:r>
+        <w:t>4. Table of Contents</w:t>
+      </w:r>
+    </w:p>
+    <w:p>
+      <w:r>
+        <w:t>5. Purpose</w:t>
+      </w:r>
+    </w:p>
+    <w:p>
+      <w:r>
+        <w:t>6. Scope</w:t>
+      </w:r>
+    </w:p>
+    <w:p>
+      <w:r>
+        <w:t>7. Programme Timeline</w:t>
+      </w:r>
+    </w:p>
+    <w:p>
+      <w:r>
+        <w:t>8. Engineering Baselines</w:t>
+      </w:r>
+    </w:p>
+    <w:p>
+      <w:r>
+        <w:t>9. Major Milestones</w:t>
+      </w:r>
+    </w:p>
+    <w:p>
+      <w:r>
+        <w:t>10. Programme Releases</w:t>
+      </w:r>
+    </w:p>
+    <w:p>
+      <w:r>
+        <w:t>11. Significant Decisions</w:t>
+      </w:r>
+    </w:p>
+    <w:p>
+      <w:r>
+        <w:t>12. Current Programme State</w:t>
+      </w:r>
+    </w:p>
+    <w:p>
+      <w:r>
+        <w:t>13. Related Documents</w:t>
+      </w:r>
+    </w:p>
+    <w:p>
+      <w:r>
+        <w:t>14. Appendices</w:t>
+      </w:r>
+    </w:p>
+    <w:p>
+      <w:pPr>
+        <w:pStyle w:val="Heading1"/>
+      </w:pPr>
+      <w:r>
+        <w:t>Purpose</w:t>
+      </w:r>
+    </w:p>
+    <w:p>
+      <w:r>
+        <w:t>Provide the permanent chronological history of the JustDefenders programme.</w:t>
+      </w:r>
+    </w:p>
+    <w:p>
+      <w:pPr>
+        <w:pStyle w:val="Heading1"/>
+      </w:pPr>
+      <w:r>
+        <w:t>Scope</w:t>
+      </w:r>
+    </w:p>
+    <w:p>
+      <w:r>
+        <w:t>Covers programme governance, engineering, architecture, operational capability, releases, milestones and engineering management.</w:t>
+      </w:r>
+    </w:p>
+    <w:p>
+      <w:pPr>
+        <w:pStyle w:val="Heading1"/>
+      </w:pPr>
+      <w:r>
+        <w:t>Programme Timeline</w:t>
+      </w:r>
+    </w:p>
+    <w:tbl>
+      <w:tblPr>
+        <w:tblStyle w:val="TableGrid"/>
+        <w:tblW w:type="auto" w:w="0"/>
+        <w:tblLook w:firstColumn="1" w:firstRow="1" w:lastColumn="0" w:lastRow="0" w:noHBand="0" w:noVBand="1" w:val="04A0"/>
+      </w:tblPr>
+      <w:tblGrid>
+        <w:gridCol w:w="1234"/>
+        <w:gridCol w:w="1234"/>
+        <w:gridCol w:w="1234"/>
+        <w:gridCol w:w="1234"/>
+        <w:gridCol w:w="1234"/>
+        <w:gridCol w:w="1234"/>
+        <w:gridCol w:w="1234"/>
+      </w:tblGrid>
+      <w:tr>
+        <w:tc>
+          <w:tcPr>
+            <w:tcW w:type="dxa" w:w="1234"/>
+          </w:tcPr>
+          <w:p>
+            <w:r>
+              <w:t>Date</w:t>
+            </w:r>
+          </w:p>
+        </w:tc>
+        <w:tc>
+          <w:tcPr>
+            <w:tcW w:type="dxa" w:w="1234"/>
+          </w:tcPr>
+          <w:p>
+            <w:r>
+              <w:t>Programme Event</w:t>
+            </w:r>
+          </w:p>
+        </w:tc>
+        <w:tc>
+          <w:tcPr>
+            <w:tcW w:type="dxa" w:w="1234"/>
+          </w:tcPr>
+          <w:p>
+            <w:r>
+              <w:t>Description</w:t>
+            </w:r>
+          </w:p>
+        </w:tc>
+        <w:tc>
+          <w:tcPr>
+            <w:tcW w:type="dxa" w:w="1234"/>
+          </w:tcPr>
+          <w:p>
+            <w:r>
+              <w:t>Work Package</w:t>
+            </w:r>
+          </w:p>
+        </w:tc>
+        <w:tc>
+          <w:tcPr>
+            <w:tcW w:type="dxa" w:w="1234"/>
+          </w:tcPr>
+          <w:p>
+            <w:r>
+              <w:t>Git Commit</w:t>
+            </w:r>
+          </w:p>
+        </w:tc>
+        <w:tc>
+          <w:tcPr>
+            <w:tcW w:type="dxa" w:w="1234"/>
+          </w:tcPr>
+          <w:p>
+            <w:r>
+              <w:t>Baseline</w:t>
+            </w:r>
+          </w:p>
+        </w:tc>
+        <w:tc>
+          <w:tcPr>
+            <w:tcW w:type="dxa" w:w="1234"/>
+          </w:tcPr>
+          <w:p>
+            <w:r>
+              <w:t>Status</w:t>
+            </w:r>
+          </w:p>
+        </w:tc>
+      </w:tr>
+    </w:tbl>
+    <w:p>
+      <w:pPr>
+        <w:pStyle w:val="Heading1"/>
+      </w:pPr>
+      <w:r>
+        <w:t>Engineering Baselines</w:t>
+      </w:r>
+    </w:p>
+    <w:tbl>
+      <w:tblPr>
+        <w:tblStyle w:val="TableGrid"/>
+        <w:tblW w:type="auto" w:w="0"/>
+        <w:tblLook w:firstColumn="1" w:firstRow="1" w:lastColumn="0" w:lastRow="0" w:noHBand="0" w:noVBand="1" w:val="04A0"/>
+      </w:tblPr>
+      <w:tblGrid>
+        <w:gridCol w:w="2160"/>
+        <w:gridCol w:w="2160"/>
+        <w:gridCol w:w="2160"/>
+        <w:gridCol w:w="2160"/>
+      </w:tblGrid>
+      <w:tr>
+        <w:tc>
+          <w:tcPr>
+            <w:tcW w:type="dxa" w:w="2160"/>
+          </w:tcPr>
+          <w:p>
+            <w:r>
+              <w:t>Baseline</w:t>
+            </w:r>
+          </w:p>
+        </w:tc>
+        <w:tc>
+          <w:tcPr>
+            <w:tcW w:type="dxa" w:w="2160"/>
+          </w:tcPr>
+          <w:p>
+            <w:r>
+              <w:t>Description</w:t>
+            </w:r>
+          </w:p>
+        </w:tc>
+        <w:tc>
+          <w:tcPr>
+            <w:tcW w:type="dxa" w:w="2160"/>
+          </w:tcPr>
+          <w:p>
+            <w:r>
+              <w:t>Date Established</w:t>
+            </w:r>
+          </w:p>
+        </w:tc>
+        <w:tc>
+          <w:tcPr>
+            <w:tcW w:type="dxa" w:w="2160"/>
+          </w:tcPr>
+          <w:p>
+            <w:r>
+              <w:t>Current Status</w:t>
+            </w:r>
+          </w:p>
+        </w:tc>
+      </w:tr>
+    </w:tbl>
+    <w:p>
+      <w:pPr>
+        <w:pStyle w:val="Heading1"/>
+      </w:pPr>
+      <w:r>
+        <w:t>Major Milestones</w:t>
+      </w:r>
+    </w:p>
+    <w:tbl>
+      <w:tblPr>
+        <w:tblStyle w:val="TableGrid"/>
+        <w:tblW w:type="auto" w:w="0"/>
+        <w:tblLook w:firstColumn="1" w:firstRow="1" w:lastColumn="0" w:lastRow="0" w:noHBand="0" w:noVBand="1" w:val="04A0"/>
+      </w:tblPr>
+      <w:tblGrid>
+        <w:gridCol w:w="2160"/>
+        <w:gridCol w:w="2160"/>
+        <w:gridCol w:w="2160"/>
+        <w:gridCol w:w="2160"/>
+      </w:tblGrid>
+      <w:tr>
+        <w:tc>
+          <w:tcPr>
+            <w:tcW w:type="dxa" w:w="2160"/>
+          </w:tcPr>
+          <w:p>
+            <w:r>
+              <w:t>Milestone</w:t>
+            </w:r>
+          </w:p>
+        </w:tc>
+        <w:tc>
+          <w:tcPr>
+            <w:tcW w:type="dxa" w:w="2160"/>
+          </w:tcPr>
+          <w:p>
+            <w:r>
+              <w:t>Target</w:t>
+            </w:r>
+          </w:p>
+        </w:tc>
+        <w:tc>
+          <w:tcPr>
+            <w:tcW w:type="dxa" w:w="2160"/>
+          </w:tcPr>
+          <w:p>
+            <w:r>
+              <w:t>Achieved</w:t>
+            </w:r>
+          </w:p>
+        </w:tc>
+        <w:tc>
+          <w:tcPr>
+            <w:tcW w:type="dxa" w:w="2160"/>
+          </w:tcPr>
+          <w:p>
+            <w:r>
+              <w:t>Status</w:t>
+            </w:r>
+          </w:p>
+        </w:tc>
+      </w:tr>
+    </w:tbl>
+    <w:p>
+      <w:pPr>
+        <w:pStyle w:val="Heading1"/>
+      </w:pPr>
+      <w:r>
+        <w:t>Programme Releases</w:t>
+      </w:r>
+    </w:p>
+    <w:tbl>
+      <w:tblPr>
+        <w:tblStyle w:val="TableGrid"/>
+        <w:tblW w:type="auto" w:w="0"/>
+        <w:tblLook w:firstColumn="1" w:firstRow="1" w:lastColumn="0" w:lastRow="0" w:noHBand="0" w:noVBand="1" w:val="04A0"/>
+      </w:tblPr>
+      <w:tblGrid>
+        <w:gridCol w:w="2160"/>
+        <w:gridCol w:w="2160"/>
+        <w:gridCol w:w="2160"/>
+        <w:gridCol w:w="2160"/>
+      </w:tblGrid>
+      <w:tr>
+        <w:tc>
+          <w:tcPr>
+            <w:tcW w:type="dxa" w:w="2160"/>
+          </w:tcPr>
+          <w:p>
+            <w:r>
+              <w:t>Release</w:t>
+            </w:r>
+          </w:p>
+        </w:tc>
+        <w:tc>
+          <w:tcPr>
+            <w:tcW w:type="dxa" w:w="2160"/>
+          </w:tcPr>
+          <w:p>
+            <w:r>
+              <w:t>Description</w:t>
+            </w:r>
+          </w:p>
+        </w:tc>
+        <w:tc>
+          <w:tcPr>
+            <w:tcW w:type="dxa" w:w="2160"/>
+          </w:tcPr>
+          <w:p>
+            <w:r>
+              <w:t>Date</w:t>
+            </w:r>
+          </w:p>
+        </w:tc>
+        <w:tc>
+          <w:tcPr>
+            <w:tcW w:type="dxa" w:w="2160"/>
+          </w:tcPr>
+          <w:p>
+            <w:r>
+              <w:t>Status</w:t>
+            </w:r>
+          </w:p>
+        </w:tc>
+      </w:tr>
+    </w:tbl>
+    <w:p>
+      <w:pPr>
+        <w:pStyle w:val="Heading1"/>
+      </w:pPr>
+      <w:r>
+        <w:t>Significant Decisions</w:t>
+      </w:r>
+    </w:p>
+    <w:tbl>
+      <w:tblPr>
+        <w:tblStyle w:val="TableGrid"/>
+        <w:tblW w:type="auto" w:w="0"/>
+        <w:tblLook w:firstColumn="1" w:firstRow="1" w:lastColumn="0" w:lastRow="0" w:noHBand="0" w:noVBand="1" w:val="04A0"/>
+      </w:tblPr>
+      <w:tblGrid>
+        <w:gridCol w:w="2160"/>
+        <w:gridCol w:w="2160"/>
+        <w:gridCol w:w="2160"/>
+        <w:gridCol w:w="2160"/>
+      </w:tblGrid>
+      <w:tr>
+        <w:tc>
+          <w:tcPr>
+            <w:tcW w:type="dxa" w:w="2160"/>
+          </w:tcPr>
+          <w:p>
+            <w:r>
+              <w:t>Date</w:t>
+            </w:r>
+          </w:p>
+        </w:tc>
+        <w:tc>
+          <w:tcPr>
+            <w:tcW w:type="dxa" w:w="2160"/>
+          </w:tcPr>
+          <w:p>
+            <w:r>
+              <w:t>Decision</w:t>
+            </w:r>
+          </w:p>
+        </w:tc>
+        <w:tc>
+          <w:tcPr>
+            <w:tcW w:type="dxa" w:w="2160"/>
+          </w:tcPr>
+          <w:p>
+            <w:r>
+              <w:t>Reason</w:t>
+            </w:r>
+          </w:p>
+        </w:tc>
+        <w:tc>
+          <w:tcPr>
+            <w:tcW w:type="dxa" w:w="2160"/>
+          </w:tcPr>
+          <w:p>
+            <w:r>
+              <w:t>Outcome</w:t>
+            </w:r>
+          </w:p>
+        </w:tc>
+      </w:tr>
+    </w:tbl>
+    <w:p>
+      <w:pPr>
+        <w:pStyle w:val="Heading1"/>
+      </w:pPr>
+      <w:r>
+        <w:t>Current Programme State</w:t>
+      </w:r>
+    </w:p>
+    <w:tbl>
+      <w:tblPr>
+        <w:tblStyle w:val="TableGrid"/>
+        <w:tblW w:type="auto" w:w="0"/>
+        <w:tblLook w:firstColumn="1" w:firstRow="1" w:lastColumn="0" w:lastRow="0" w:noHBand="0" w:noVBand="1" w:val="04A0"/>
+      </w:tblPr>
+      <w:tblGrid>
+        <w:gridCol w:w="4320"/>
+        <w:gridCol w:w="4320"/>
+      </w:tblGrid>
+      <w:tr>
+        <w:tc>
+          <w:tcPr>
+            <w:tcW w:type="dxa" w:w="4320"/>
+          </w:tcPr>
+          <w:p>
+            <w:r>
+              <w:t>Field</w:t>
             </w:r>
           </w:p>
         </w:tc>
@@ -101,7 +899,7 @@
           </w:tcPr>
           <w:p>
             <w:r>
-              <w:t>ProgrammeManagement\00 Programme Office\</w:t>
+              <w:t>Value</w:t>
             </w:r>
           </w:p>
         </w:tc>
@@ -113,7 +911,7 @@
           </w:tcPr>
           <w:p>
             <w:r>
-              <w:t>Owner</w:t>
+              <w:t>Current Programme Phase</w:t>
             </w:r>
           </w:p>
         </w:tc>
@@ -122,9 +920,7 @@
             <w:tcW w:type="dxa" w:w="4320"/>
           </w:tcPr>
           <w:p>
-            <w:r>
-              <w:t>Programme Office</w:t>
-            </w:r>
+            <w:r/>
           </w:p>
         </w:tc>
       </w:tr>
@@ -135,7 +931,7 @@
           </w:tcPr>
           <w:p>
             <w:r>
-              <w:t>Version</w:t>
+              <w:t>Current Baseline</w:t>
             </w:r>
           </w:p>
         </w:tc>
@@ -144,9 +940,7 @@
             <w:tcW w:type="dxa" w:w="4320"/>
           </w:tcPr>
           <w:p>
-            <w:r>
-              <w:t>1.0</w:t>
-            </w:r>
+            <w:r/>
           </w:p>
         </w:tc>
       </w:tr>
@@ -157,7 +951,7 @@
           </w:tcPr>
           <w:p>
             <w:r>
-              <w:t>Date</w:t>
+              <w:t>Current Branch</w:t>
             </w:r>
           </w:p>
         </w:tc>
@@ -166,13 +960,112 @@
             <w:tcW w:type="dxa" w:w="4320"/>
           </w:tcPr>
           <w:p>
+            <w:r/>
+          </w:p>
+        </w:tc>
+      </w:tr>
+      <w:tr>
+        <w:tc>
+          <w:tcPr>
+            <w:tcW w:type="dxa" w:w="4320"/>
+          </w:tcPr>
+          <w:p>
             <w:r>
-              <w:t>02 August 2026</w:t>
+              <w:t>Current Work Package</w:t>
             </w:r>
+          </w:p>
+        </w:tc>
+        <w:tc>
+          <w:tcPr>
+            <w:tcW w:type="dxa" w:w="4320"/>
+          </w:tcPr>
+          <w:p>
+            <w:r/>
+          </w:p>
+        </w:tc>
+      </w:tr>
+      <w:tr>
+        <w:tc>
+          <w:tcPr>
+            <w:tcW w:type="dxa" w:w="4320"/>
+          </w:tcPr>
+          <w:p>
+            <w:r>
+              <w:t>Current Objective</w:t>
+            </w:r>
+          </w:p>
+        </w:tc>
+        <w:tc>
+          <w:tcPr>
+            <w:tcW w:type="dxa" w:w="4320"/>
+          </w:tcPr>
+          <w:p>
+            <w:r/>
           </w:p>
         </w:tc>
       </w:tr>
     </w:tbl>
+    <w:p>
+      <w:pPr>
+        <w:pStyle w:val="Heading1"/>
+      </w:pPr>
+      <w:r>
+        <w:t>Related Documents</w:t>
+      </w:r>
+    </w:p>
+    <w:p>
+      <w:pPr>
+        <w:pStyle w:val="ListBullet"/>
+      </w:pPr>
+      <w:r>
+        <w:t>Engineering Policies</w:t>
+      </w:r>
+    </w:p>
+    <w:p>
+      <w:pPr>
+        <w:pStyle w:val="ListBullet"/>
+      </w:pPr>
+      <w:r>
+        <w:t>Programme Charter</w:t>
+      </w:r>
+    </w:p>
+    <w:p>
+      <w:pPr>
+        <w:pStyle w:val="ListBullet"/>
+      </w:pPr>
+      <w:r>
+        <w:t>Programme Roadmap</w:t>
+      </w:r>
+    </w:p>
+    <w:p>
+      <w:pPr>
+        <w:pStyle w:val="ListBullet"/>
+      </w:pPr>
+      <w:r>
+        <w:t>Engineering Configuration Management Database</w:t>
+      </w:r>
+    </w:p>
+    <w:p>
+      <w:pPr>
+        <w:pStyle w:val="ListBullet"/>
+      </w:pPr>
+      <w:r>
+        <w:t>Programme Control Book</w:t>
+      </w:r>
+    </w:p>
+    <w:p>
+      <w:pPr>
+        <w:pStyle w:val="Heading1"/>
+      </w:pPr>
+      <w:r>
+        <w:t>Appendices</w:t>
+      </w:r>
+    </w:p>
+    <w:p>
+      <w:r>
+        <w:t>None.</w:t>
+      </w:r>
+    </w:p>
     <w:sectPr>
       <w:pgSz w:w="12240" w:h="15840"/>
       <w:pgMar w:top="1440" w:right="1800" w:bottom="1440" w:left="1800" w:header="720" w:footer="720" w:gutter="0"/>

</xml_diff>